<commit_message>
docs(release): 0.7.2 发布文档收口（计划书 v3.2 + 演示站 README）
- docs/项目计划书.md 升级 v3.2：对齐 0.7.2 发布实况（最新发布段、当前发布基线、最新 tag、§1.2/§4.1、里程碑表新增 0.7.2 行并把 0.7.1 降为上一版、§九 CHANGELOG 演进），并用 scripts/md2docx.py 重新生成 docs/项目计划书.docx（md 与 docx 成对同步）
- 官网演示/README.md 补充「自我进化实验室」板块说明（锚点、可调参数、两处可亲手验证的交互、口径边界）
</commit_message>
<xml_diff>
--- a/docs/项目计划书.docx
+++ b/docs/项目计划书.docx
@@ -33,7 +33,7 @@
           <w:color w:val="555F70"/>
           <w:sz w:val="19"/>
         </w:rPr>
-        <w:t>当前发布基线 0.7.1（赛事版，2026-09-11）</w:t>
+        <w:t>当前发布基线 0.7.2（赛事版，2026-09-14）</w:t>
       </w:r>
       <w:r>
         <w:rPr>
@@ -96,7 +96,7 @@
           <w:color w:val="555F70"/>
           <w:sz w:val="19"/>
         </w:rPr>
-        <w:t>版本：v3.1（2026-09-12：</w:t>
+        <w:t>版本：v3.2（2026-09-14：</w:t>
       </w:r>
       <w:r>
         <w:rPr>
@@ -106,7 +106,7 @@
           <w:color w:val="555F70"/>
           <w:sz w:val="19"/>
         </w:rPr>
-        <w:t>对齐 0.7.1 发布实况</w:t>
+        <w:t>对齐 0.7.2 发布实况</w:t>
       </w:r>
       <w:r>
         <w:rPr>
@@ -116,7 +116,7 @@
           <w:color w:val="555F70"/>
           <w:sz w:val="19"/>
         </w:rPr>
-        <w:t>——0.7.0/0.7.1 连续发布（5 类文书任务 + 知识图谱 + 多模态材料 → 待办缺陷修复 + 翻译统一 AI 接口与文档全文翻译 + 覆盖安装缺陷修复）；里程碑表补记两版实际交付并区分"0.7.x 未完成项并入 0.8.0"；新增</w:t>
+        <w:t>——新增</w:t>
       </w:r>
       <w:r>
         <w:rPr>
@@ -126,7 +126,7 @@
           <w:color w:val="555F70"/>
           <w:sz w:val="19"/>
         </w:rPr>
-        <w:t>发布渠道</w:t>
+        <w:t>「自我进化」可视化页</w:t>
       </w:r>
       <w:r>
         <w:rPr>
@@ -136,7 +136,25 @@
           <w:color w:val="555F70"/>
           <w:sz w:val="19"/>
         </w:rPr>
-        <w:t>（GitHub Releases 安装包直链、Cloudflare Pages 产品演示站）与两条风险对策（未签名安装包被 SmartScreen 拦、境外托管在国内的访问波动）；§4.1 / §5.1 / §七 / §九 同步。v3.0（2026-09-08：</w:t>
+        <w:t xml:space="preserve">（应用内 </w:t>
+      </w:r>
+      <w:r>
+        <w:rPr>
+          <w:rFonts w:ascii="Consolas" w:hAnsi="Consolas" w:eastAsia="Microsoft YaHei"/>
+          <w:color w:val="8A1F18"/>
+          <w:sz w:val="19"/>
+        </w:rPr>
+        <w:t>/evolution</w:t>
+      </w:r>
+      <w:r>
+        <w:rPr>
+          <w:rFonts w:ascii="Segoe UI" w:hAnsi="Segoe UI" w:eastAsia="Microsoft YaHei"/>
+          <w:b w:val="0"/>
+          <w:i/>
+          <w:color w:val="555F70"/>
+          <w:sz w:val="19"/>
+        </w:rPr>
+        <w:t xml:space="preserve"> + 演示站「自我进化实验室」板块；</w:t>
       </w:r>
       <w:r>
         <w:rPr>
@@ -146,7 +164,7 @@
           <w:color w:val="555F70"/>
           <w:sz w:val="19"/>
         </w:rPr>
-        <w:t>把 0.8.0 主线「联邦配方进化」并入计划书</w:t>
+        <w:t>方案稿口径</w:t>
       </w:r>
       <w:r>
         <w:rPr>
@@ -156,16 +174,17 @@
           <w:color w:val="555F70"/>
           <w:sz w:val="19"/>
         </w:rPr>
-        <w:t xml:space="preserve">——0.7.0 中文法库接入之后的下一条产品主线；新增关联 </w:t>
-      </w:r>
-      <w:r>
-        <w:rPr>
-          <w:rFonts w:ascii="Segoe UI" w:hAnsi="Segoe UI" w:eastAsia="Microsoft YaHei"/>
-          <w:b w:val="0"/>
-          <w:color w:val="1A4F9C"/>
+        <w:t>：加权聚合 / 差分隐私 / K 匿名 / 指纹 / 采纳判定为真实实现，客户端行为为协议仿真，</w:t>
+      </w:r>
+      <w:r>
+        <w:rPr>
+          <w:rFonts w:ascii="Segoe UI" w:hAnsi="Segoe UI" w:eastAsia="Microsoft YaHei"/>
+          <w:b/>
+          <w:i/>
+          <w:color w:val="555F70"/>
           <w:sz w:val="19"/>
         </w:rPr>
-        <w:t>12-联邦配方进化方案.md</w:t>
+        <w:t>不是强化学习</w:t>
       </w:r>
       <w:r>
         <w:rPr>
@@ -175,7 +194,43 @@
           <w:color w:val="555F70"/>
           <w:sz w:val="19"/>
         </w:rPr>
-        <w:t>、§5.6 技术方案概要、§6.2 任务拆解与 0.8.0 里程碑行、§8 风险对策；联邦配方进化为</w:t>
+        <w:t xml:space="preserve">，故不进「已实现」清单）；悬浮球资源目录递增 </w:t>
+      </w:r>
+      <w:r>
+        <w:rPr>
+          <w:rFonts w:ascii="Consolas" w:hAnsi="Consolas" w:eastAsia="Microsoft YaHei"/>
+          <w:color w:val="8A1F18"/>
+          <w:sz w:val="19"/>
+        </w:rPr>
+        <w:t>win-unpacked-0.7.2</w:t>
+      </w:r>
+      <w:r>
+        <w:rPr>
+          <w:rFonts w:ascii="Segoe UI" w:hAnsi="Segoe UI" w:eastAsia="Microsoft YaHei"/>
+          <w:b w:val="0"/>
+          <w:i/>
+          <w:color w:val="555F70"/>
+          <w:sz w:val="19"/>
+        </w:rPr>
+        <w:t xml:space="preserve">；出包并发布 GitHub Release（tag </w:t>
+      </w:r>
+      <w:r>
+        <w:rPr>
+          <w:rFonts w:ascii="Consolas" w:hAnsi="Consolas" w:eastAsia="Microsoft YaHei"/>
+          <w:color w:val="8A1F18"/>
+          <w:sz w:val="19"/>
+        </w:rPr>
+        <w:t>v0.7.2-赛事版</w:t>
+      </w:r>
+      <w:r>
+        <w:rPr>
+          <w:rFonts w:ascii="Segoe UI" w:hAnsi="Segoe UI" w:eastAsia="Microsoft YaHei"/>
+          <w:b w:val="0"/>
+          <w:i/>
+          <w:color w:val="555F70"/>
+          <w:sz w:val="19"/>
+        </w:rPr>
+        <w:t>）+ 演示站同步上线；§1.2 / §4.1 / §六 里程碑表 / §九 同步。v3.1（2026-09-12：</w:t>
       </w:r>
       <w:r>
         <w:rPr>
@@ -185,7 +240,7 @@
           <w:color w:val="555F70"/>
           <w:sz w:val="19"/>
         </w:rPr>
-        <w:t>方案稿（未实现）</w:t>
+        <w:t>对齐 0.7.1 发布实况</w:t>
       </w:r>
       <w:r>
         <w:rPr>
@@ -195,15 +250,17 @@
           <w:color w:val="555F70"/>
           <w:sz w:val="19"/>
         </w:rPr>
-        <w:t xml:space="preserve">，如实标注"规划/🚧"，不影响 0.6.0「已落地」口径。v2.5（2026-09-07）内容全部保留：按"AI 杭州 码动未来"初赛五维评分标准增补——新增三章末《市场与商业可行性论证》、五章 5.4/5.5《大模型环节流程细节与架构取舍》，扩充八章风险对策；五维评分对照与自评属内部自查材料、不放入计划书正文，见 docs/08）｜日期：2026-09-12 关联文档：《README.md》《CHANGELOG.md》《docs/README.md》《docs/功能演示报告.md》《docs/06-参赛改进方案.md》《docs/07-真机验收清单.md》《docs/08-参赛材料包.md》《docs/09-真机验收执行指引.md》《docs/05-优化路线图.md》《docs/11-赛事版改动说明.md》《docs/12-联邦配方进化方案.md》（0.8.0 主线方案稿）《法库ETL工作区/ETL说明.md》《Project-Plan-EN.md / Project-Plan-EN.docx》《Feature-Demo-Report-EN.md / Feature-Demo-Report-EN.docx》（英文镜像，随本版同步） 代码仓库：主程序 https://github.com/lin612320/Legal-Workspace （dev 分支，tag </w:t>
-      </w:r>
-      <w:r>
-        <w:rPr>
-          <w:rFonts w:ascii="Consolas" w:hAnsi="Consolas" w:eastAsia="Microsoft YaHei"/>
-          <w:color w:val="8A1F18"/>
+        <w:t>——0.7.0/0.7.1 连续发布（5 类文书任务 + 知识图谱 + 多模态材料 → 待办缺陷修复 + 翻译统一 AI 接口与文档全文翻译 + 覆盖安装缺陷修复）；里程碑表补记两版实际交付并区分"0.7.x 未完成项并入 0.8.0"；新增</w:t>
+      </w:r>
+      <w:r>
+        <w:rPr>
+          <w:rFonts w:ascii="Segoe UI" w:hAnsi="Segoe UI" w:eastAsia="Microsoft YaHei"/>
+          <w:b/>
+          <w:i/>
+          <w:color w:val="555F70"/>
           <w:sz w:val="19"/>
         </w:rPr>
-        <w:t>v0.6.0</w:t>
+        <w:t>发布渠道</w:t>
       </w:r>
       <w:r>
         <w:rPr>
@@ -213,15 +270,17 @@
           <w:color w:val="555F70"/>
           <w:sz w:val="19"/>
         </w:rPr>
-        <w:t xml:space="preserve">；赛事版分支 </w:t>
-      </w:r>
-      <w:r>
-        <w:rPr>
-          <w:rFonts w:ascii="Consolas" w:hAnsi="Consolas" w:eastAsia="Microsoft YaHei"/>
-          <w:color w:val="8A1F18"/>
+        <w:t>（GitHub Releases 安装包直链、Cloudflare Pages 产品演示站）与两条风险对策（未签名安装包被 SmartScreen 拦、境外托管在国内的访问波动）；§4.1 / §5.1 / §七 / §九 同步。v3.0（2026-09-08：</w:t>
+      </w:r>
+      <w:r>
+        <w:rPr>
+          <w:rFonts w:ascii="Segoe UI" w:hAnsi="Segoe UI" w:eastAsia="Microsoft YaHei"/>
+          <w:b/>
+          <w:i/>
+          <w:color w:val="555F70"/>
           <w:sz w:val="19"/>
         </w:rPr>
-        <w:t>feature/赛事版</w:t>
+        <w:t>把 0.8.0 主线「联邦配方进化」并入计划书</w:t>
       </w:r>
       <w:r>
         <w:rPr>
@@ -231,7 +290,26 @@
           <w:color w:val="555F70"/>
           <w:sz w:val="19"/>
         </w:rPr>
-        <w:t xml:space="preserve">，最新 tag </w:t>
+        <w:t xml:space="preserve">——0.7.0 中文法库接入之后的下一条产品主线；新增关联 </w:t>
+      </w:r>
+      <w:r>
+        <w:rPr>
+          <w:rFonts w:ascii="Segoe UI" w:hAnsi="Segoe UI" w:eastAsia="Microsoft YaHei"/>
+          <w:b w:val="0"/>
+          <w:color w:val="1A4F9C"/>
+          <w:sz w:val="19"/>
+        </w:rPr>
+        <w:t>12-联邦配方进化方案.md</w:t>
+      </w:r>
+      <w:r>
+        <w:rPr>
+          <w:rFonts w:ascii="Segoe UI" w:hAnsi="Segoe UI" w:eastAsia="Microsoft YaHei"/>
+          <w:b w:val="0"/>
+          <w:i/>
+          <w:color w:val="555F70"/>
+          <w:sz w:val="19"/>
+        </w:rPr>
+        <w:t>、§5.6 技术方案概要、§6.2 任务拆解与 0.8.0 里程碑行、§8 风险对策；联邦配方进化为</w:t>
       </w:r>
       <w:r>
         <w:rPr>
@@ -241,7 +319,7 @@
           <w:color w:val="555F70"/>
           <w:sz w:val="19"/>
         </w:rPr>
-        <w:t>`v0.7.1-赛事版`</w:t>
+        <w:t>方案稿（未实现）</w:t>
       </w:r>
       <w:r>
         <w:rPr>
@@ -251,7 +329,43 @@
           <w:color w:val="555F70"/>
           <w:sz w:val="19"/>
         </w:rPr>
-        <w:t xml:space="preserve">，含 0.7.0 / 0.7.1 两次发布）｜移动端演示 https://github.com/lin612320/legal-workbench-mobile （main 分支） 发布渠道（0.7.1 起）：安装包 </w:t>
+        <w:t xml:space="preserve">，如实标注"规划/🚧"，不影响 0.6.0「已落地」口径。v2.5（2026-09-07）内容全部保留：按"AI 杭州 码动未来"初赛五维评分标准增补——新增三章末《市场与商业可行性论证》、五章 5.4/5.5《大模型环节流程细节与架构取舍》，扩充八章风险对策；五维评分对照与自评属内部自查材料、不放入计划书正文，见 docs/08）｜日期：2026-09-12 关联文档：《README.md》《CHANGELOG.md》《docs/README.md》《docs/功能演示报告.md》《docs/06-参赛改进方案.md》《docs/07-真机验收清单.md》《docs/08-参赛材料包.md》《docs/09-真机验收执行指引.md》《docs/05-优化路线图.md》《docs/11-赛事版改动说明.md》《docs/12-联邦配方进化方案.md》（0.8.0 主线方案稿）《法库ETL工作区/ETL说明.md》《Project-Plan-EN.md / Project-Plan-EN.docx》《Feature-Demo-Report-EN.md / Feature-Demo-Report-EN.docx》（英文镜像，随本版同步） 代码仓库：主程序 https://github.com/lin612320/Legal-Workspace （dev 分支，tag </w:t>
+      </w:r>
+      <w:r>
+        <w:rPr>
+          <w:rFonts w:ascii="Consolas" w:hAnsi="Consolas" w:eastAsia="Microsoft YaHei"/>
+          <w:color w:val="8A1F18"/>
+          <w:sz w:val="19"/>
+        </w:rPr>
+        <w:t>v0.6.0</w:t>
+      </w:r>
+      <w:r>
+        <w:rPr>
+          <w:rFonts w:ascii="Segoe UI" w:hAnsi="Segoe UI" w:eastAsia="Microsoft YaHei"/>
+          <w:b w:val="0"/>
+          <w:i/>
+          <w:color w:val="555F70"/>
+          <w:sz w:val="19"/>
+        </w:rPr>
+        <w:t xml:space="preserve">；赛事版分支 </w:t>
+      </w:r>
+      <w:r>
+        <w:rPr>
+          <w:rFonts w:ascii="Consolas" w:hAnsi="Consolas" w:eastAsia="Microsoft YaHei"/>
+          <w:color w:val="8A1F18"/>
+          <w:sz w:val="19"/>
+        </w:rPr>
+        <w:t>feature/赛事版</w:t>
+      </w:r>
+      <w:r>
+        <w:rPr>
+          <w:rFonts w:ascii="Segoe UI" w:hAnsi="Segoe UI" w:eastAsia="Microsoft YaHei"/>
+          <w:b w:val="0"/>
+          <w:i/>
+          <w:color w:val="555F70"/>
+          <w:sz w:val="19"/>
+        </w:rPr>
+        <w:t xml:space="preserve">，最新 tag </w:t>
       </w:r>
       <w:r>
         <w:rPr>
@@ -261,7 +375,7 @@
           <w:color w:val="555F70"/>
           <w:sz w:val="19"/>
         </w:rPr>
-        <w:t>GitHub Releases 直链</w:t>
+        <w:t>`v0.7.2-赛事版`</w:t>
       </w:r>
       <w:r>
         <w:rPr>
@@ -271,15 +385,17 @@
           <w:color w:val="555F70"/>
           <w:sz w:val="19"/>
         </w:rPr>
-        <w:t>（</w:t>
-      </w:r>
-      <w:r>
-        <w:rPr>
-          <w:rFonts w:ascii="Segoe UI" w:hAnsi="Segoe UI" w:eastAsia="Microsoft YaHei"/>
-          <w:color w:val="1A4F9C"/>
+        <w:t xml:space="preserve">，含 0.7.0 / 0.7.1 / 0.7.2 三次发布）｜移动端演示 https://github.com/lin612320/legal-workbench-mobile （main 分支） 发布渠道（0.7.1 起）：安装包 </w:t>
+      </w:r>
+      <w:r>
+        <w:rPr>
+          <w:rFonts w:ascii="Segoe UI" w:hAnsi="Segoe UI" w:eastAsia="Microsoft YaHei"/>
+          <w:b/>
+          <w:i/>
+          <w:color w:val="555F70"/>
           <w:sz w:val="19"/>
         </w:rPr>
-        <w:t>https://github.com/lin612320/Legal-Workspace/releases</w:t>
+        <w:t>GitHub Releases 直链</w:t>
       </w:r>
       <w:r>
         <w:rPr>
@@ -289,6 +405,24 @@
           <w:color w:val="555F70"/>
           <w:sz w:val="19"/>
         </w:rPr>
+        <w:t>（</w:t>
+      </w:r>
+      <w:r>
+        <w:rPr>
+          <w:rFonts w:ascii="Segoe UI" w:hAnsi="Segoe UI" w:eastAsia="Microsoft YaHei"/>
+          <w:color w:val="1A4F9C"/>
+          <w:sz w:val="19"/>
+        </w:rPr>
+        <w:t>https://github.com/lin612320/Legal-Workspace/releases</w:t>
+      </w:r>
+      <w:r>
+        <w:rPr>
+          <w:rFonts w:ascii="Segoe UI" w:hAnsi="Segoe UI" w:eastAsia="Microsoft YaHei"/>
+          <w:b w:val="0"/>
+          <w:i/>
+          <w:color w:val="555F70"/>
+          <w:sz w:val="19"/>
+        </w:rPr>
         <w:t xml:space="preserve">，单文件 135 MB，公开仓库免登录下载）＋ </w:t>
       </w:r>
       <w:r>
@@ -645,7 +779,277 @@
           <w:color w:val="555F70"/>
           <w:sz w:val="19"/>
         </w:rPr>
-        <w:t>最新发布（0.7.1 · 2026-09-11，分支 `feature/赛事版`，tag `v0.7.1-赛事版`）</w:t>
+        <w:t>最新发布（0.7.2 · 2026-09-14，分支 `feature/赛事版`，tag `v0.7.2-赛事版`）</w:t>
+      </w:r>
+      <w:r>
+        <w:rPr>
+          <w:rFonts w:ascii="Segoe UI" w:hAnsi="Segoe UI" w:eastAsia="Microsoft YaHei"/>
+          <w:b w:val="0"/>
+          <w:i/>
+          <w:color w:val="555F70"/>
+          <w:sz w:val="19"/>
+        </w:rPr>
+        <w:t xml:space="preserve">：桌面端已出包 </w:t>
+      </w:r>
+      <w:r>
+        <w:rPr>
+          <w:rFonts w:ascii="Consolas" w:hAnsi="Consolas" w:eastAsia="Microsoft YaHei"/>
+          <w:color w:val="8A1F18"/>
+          <w:sz w:val="19"/>
+        </w:rPr>
+        <w:t>发布包/法元_0.7.2_赛事版_x64-setup.exe</w:t>
+      </w:r>
+      <w:r>
+        <w:rPr>
+          <w:rFonts w:ascii="Segoe UI" w:hAnsi="Segoe UI" w:eastAsia="Microsoft YaHei"/>
+          <w:b w:val="0"/>
+          <w:i/>
+          <w:color w:val="555F70"/>
+          <w:sz w:val="19"/>
+        </w:rPr>
+        <w:t>（</w:t>
+      </w:r>
+      <w:r>
+        <w:rPr>
+          <w:rFonts w:ascii="Segoe UI" w:hAnsi="Segoe UI" w:eastAsia="Microsoft YaHei"/>
+          <w:b/>
+          <w:i/>
+          <w:color w:val="555F70"/>
+          <w:sz w:val="19"/>
+        </w:rPr>
+        <w:t>135.11 MB</w:t>
+      </w:r>
+      <w:r>
+        <w:rPr>
+          <w:rFonts w:ascii="Segoe UI" w:hAnsi="Segoe UI" w:eastAsia="Microsoft YaHei"/>
+          <w:b w:val="0"/>
+          <w:i/>
+          <w:color w:val="555F70"/>
+          <w:sz w:val="19"/>
+        </w:rPr>
+        <w:t xml:space="preserve">，内嵌 467.4 MB 预置法库 + 悬浮球 </w:t>
+      </w:r>
+      <w:r>
+        <w:rPr>
+          <w:rFonts w:ascii="Consolas" w:hAnsi="Consolas" w:eastAsia="Microsoft YaHei"/>
+          <w:color w:val="8A1F18"/>
+          <w:sz w:val="19"/>
+        </w:rPr>
+        <w:t>win-unpacked-0.7.2</w:t>
+      </w:r>
+      <w:r>
+        <w:rPr>
+          <w:rFonts w:ascii="Segoe UI" w:hAnsi="Segoe UI" w:eastAsia="Microsoft YaHei"/>
+          <w:b w:val="0"/>
+          <w:i/>
+          <w:color w:val="555F70"/>
+          <w:sz w:val="19"/>
+        </w:rPr>
+        <w:t xml:space="preserve">）并发布 </w:t>
+      </w:r>
+      <w:r>
+        <w:rPr>
+          <w:rFonts w:ascii="Segoe UI" w:hAnsi="Segoe UI" w:eastAsia="Microsoft YaHei"/>
+          <w:b/>
+          <w:i/>
+          <w:color w:val="555F70"/>
+          <w:sz w:val="19"/>
+        </w:rPr>
+        <w:t>GitHub Release</w:t>
+      </w:r>
+      <w:r>
+        <w:rPr>
+          <w:rFonts w:ascii="Segoe UI" w:hAnsi="Segoe UI" w:eastAsia="Microsoft YaHei"/>
+          <w:b w:val="0"/>
+          <w:i/>
+          <w:color w:val="555F70"/>
+          <w:sz w:val="19"/>
+        </w:rPr>
+        <w:t xml:space="preserve">（资产 </w:t>
+      </w:r>
+      <w:r>
+        <w:rPr>
+          <w:rFonts w:ascii="Consolas" w:hAnsi="Consolas" w:eastAsia="Microsoft YaHei"/>
+          <w:color w:val="8A1F18"/>
+          <w:sz w:val="19"/>
+        </w:rPr>
+        <w:t>Faron-0.7.2-x64-setup.exe</w:t>
+      </w:r>
+      <w:r>
+        <w:rPr>
+          <w:rFonts w:ascii="Segoe UI" w:hAnsi="Segoe UI" w:eastAsia="Microsoft YaHei"/>
+          <w:b w:val="0"/>
+          <w:i/>
+          <w:color w:val="555F70"/>
+          <w:sz w:val="19"/>
+        </w:rPr>
+        <w:t>，免登录直链）；</w:t>
+      </w:r>
+      <w:r>
+        <w:rPr>
+          <w:rFonts w:ascii="Segoe UI" w:hAnsi="Segoe UI" w:eastAsia="Microsoft YaHei"/>
+          <w:b/>
+          <w:i/>
+          <w:color w:val="555F70"/>
+          <w:sz w:val="19"/>
+        </w:rPr>
+        <w:t>产品演示站已同步上线</w:t>
+      </w:r>
+      <w:r>
+        <w:rPr>
+          <w:rFonts w:ascii="Segoe UI" w:hAnsi="Segoe UI" w:eastAsia="Microsoft YaHei"/>
+          <w:b w:val="0"/>
+          <w:i/>
+          <w:color w:val="555F70"/>
+          <w:sz w:val="19"/>
+        </w:rPr>
+        <w:t>新板块。本版主线：</w:t>
+      </w:r>
+      <w:r>
+        <w:rPr>
+          <w:rFonts w:ascii="Segoe UI" w:hAnsi="Segoe UI" w:eastAsia="Microsoft YaHei"/>
+          <w:b/>
+          <w:i/>
+          <w:color w:val="555F70"/>
+          <w:sz w:val="19"/>
+        </w:rPr>
+        <w:t>「自我进化」可视化页</w:t>
+      </w:r>
+      <w:r>
+        <w:rPr>
+          <w:rFonts w:ascii="Segoe UI" w:hAnsi="Segoe UI" w:eastAsia="Microsoft YaHei"/>
+          <w:b w:val="0"/>
+          <w:i/>
+          <w:color w:val="555F70"/>
+          <w:sz w:val="19"/>
+        </w:rPr>
+        <w:t>——把 docs/12 联邦配方进化（FRE）方案稿的闭环跑成可交互代码（本地信号 → 匿名进化包 → 隐私处理 → 加权聚合 → 配方版本 → A/B 采纳），真数据优先读本机任务日志、无数据走协议仿真。</w:t>
+      </w:r>
+      <w:r>
+        <w:rPr>
+          <w:rFonts w:ascii="Segoe UI" w:hAnsi="Segoe UI" w:eastAsia="Microsoft YaHei"/>
+          <w:b/>
+          <w:i/>
+          <w:color w:val="555F70"/>
+          <w:sz w:val="19"/>
+        </w:rPr>
+        <w:t>口径务必注意</w:t>
+      </w:r>
+      <w:r>
+        <w:rPr>
+          <w:rFonts w:ascii="Segoe UI" w:hAnsi="Segoe UI" w:eastAsia="Microsoft YaHei"/>
+          <w:b w:val="0"/>
+          <w:i/>
+          <w:color w:val="555F70"/>
+          <w:sz w:val="19"/>
+        </w:rPr>
+        <w:t xml:space="preserve">：该页是 </w:t>
+      </w:r>
+      <w:r>
+        <w:rPr>
+          <w:rFonts w:ascii="Segoe UI" w:hAnsi="Segoe UI" w:eastAsia="Microsoft YaHei"/>
+          <w:b/>
+          <w:i/>
+          <w:color w:val="555F70"/>
+          <w:sz w:val="19"/>
+        </w:rPr>
+        <w:t>0.8.0 规划 · 方案稿的可视化</w:t>
+      </w:r>
+      <w:r>
+        <w:rPr>
+          <w:rFonts w:ascii="Segoe UI" w:hAnsi="Segoe UI" w:eastAsia="Microsoft YaHei"/>
+          <w:b w:val="0"/>
+          <w:i/>
+          <w:color w:val="555F70"/>
+          <w:sz w:val="19"/>
+        </w:rPr>
+        <w:t>，不是已落地功能；加权聚合 / 差分隐私 / K 匿名 / 指纹 / 采纳判定为真实实现，客户端（4–5 个虚拟律所用户）行为为协议仿真；</w:t>
+      </w:r>
+      <w:r>
+        <w:rPr>
+          <w:rFonts w:ascii="Segoe UI" w:hAnsi="Segoe UI" w:eastAsia="Microsoft YaHei"/>
+          <w:b/>
+          <w:i/>
+          <w:color w:val="555F70"/>
+          <w:sz w:val="19"/>
+        </w:rPr>
+        <w:t>它不是强化学习</w:t>
+      </w:r>
+      <w:r>
+        <w:rPr>
+          <w:rFonts w:ascii="Segoe UI" w:hAnsi="Segoe UI" w:eastAsia="Microsoft YaHei"/>
+          <w:b w:val="0"/>
+          <w:i/>
+          <w:color w:val="555F70"/>
+          <w:sz w:val="19"/>
+        </w:rPr>
+        <w:t>（无策略梯度与价值函数）。出包前质量闸门：</w:t>
+      </w:r>
+      <w:r>
+        <w:rPr>
+          <w:rFonts w:ascii="Consolas" w:hAnsi="Consolas" w:eastAsia="Microsoft YaHei"/>
+          <w:color w:val="8A1F18"/>
+          <w:sz w:val="19"/>
+        </w:rPr>
+        <w:t>npm run build</w:t>
+      </w:r>
+      <w:r>
+        <w:rPr>
+          <w:rFonts w:ascii="Segoe UI" w:hAnsi="Segoe UI" w:eastAsia="Microsoft YaHei"/>
+          <w:b w:val="0"/>
+          <w:i/>
+          <w:color w:val="555F70"/>
+          <w:sz w:val="19"/>
+        </w:rPr>
+        <w:t xml:space="preserve"> exit 0 + </w:t>
+      </w:r>
+      <w:r>
+        <w:rPr>
+          <w:rFonts w:ascii="Consolas" w:hAnsi="Consolas" w:eastAsia="Microsoft YaHei"/>
+          <w:color w:val="8A1F18"/>
+          <w:sz w:val="19"/>
+        </w:rPr>
+        <w:t>cargo test</w:t>
+      </w:r>
+      <w:r>
+        <w:rPr>
+          <w:rFonts w:ascii="Segoe UI" w:hAnsi="Segoe UI" w:eastAsia="Microsoft YaHei"/>
+          <w:b w:val="0"/>
+          <w:i/>
+          <w:color w:val="555F70"/>
+          <w:sz w:val="19"/>
+        </w:rPr>
+        <w:t xml:space="preserve"> </w:t>
+      </w:r>
+      <w:r>
+        <w:rPr>
+          <w:rFonts w:ascii="Segoe UI" w:hAnsi="Segoe UI" w:eastAsia="Microsoft YaHei"/>
+          <w:b/>
+          <w:i/>
+          <w:color w:val="555F70"/>
+          <w:sz w:val="19"/>
+        </w:rPr>
+        <w:t>17/17</w:t>
+      </w:r>
+      <w:r>
+        <w:rPr>
+          <w:rFonts w:ascii="Segoe UI" w:hAnsi="Segoe UI" w:eastAsia="Microsoft YaHei"/>
+          <w:b w:val="0"/>
+          <w:i/>
+          <w:color w:val="555F70"/>
+          <w:sz w:val="19"/>
+        </w:rPr>
+        <w:t xml:space="preserve"> + 预置库个人数据只读核验通过。 </w:t>
+      </w:r>
+      <w:r>
+        <w:rPr>
+          <w:rFonts w:ascii="Segoe UI" w:hAnsi="Segoe UI" w:eastAsia="Microsoft YaHei"/>
+          <w:b/>
+          <w:i/>
+          <w:color w:val="555F70"/>
+          <w:sz w:val="19"/>
+        </w:rPr>
+        <w:t>上一版（0.7.1 · 2026-09-11，分支 `feature/赛事版`，tag `v0.7.1-赛事版`）</w:t>
       </w:r>
       <w:r>
         <w:rPr>
@@ -1032,7 +1436,7 @@
         <w:pStyle w:val="Heading3"/>
       </w:pPr>
       <w:r>
-        <w:t>1.2 目标（历史 0.6.0 验收口径 → 当前发布 0.7.1）</w:t>
+        <w:t>1.2 目标（历史 0.6.0 验收口径 → 当前发布 0.7.2）</w:t>
       </w:r>
     </w:p>
     <w:p>
@@ -1623,7 +2027,7 @@
                 <w:i w:val="0"/>
                 <w:sz w:val="18"/>
               </w:rPr>
-              <w:t>0.7.1 赛事版已出包并发布</w:t>
+              <w:t>0.7.2 赛事版已出包并发布</w:t>
             </w:r>
             <w:r>
               <w:rPr>
@@ -1632,7 +2036,7 @@
                 <w:i w:val="0"/>
                 <w:sz w:val="18"/>
               </w:rPr>
-              <w:t xml:space="preserve">（2026-09-11；分支 </w:t>
+              <w:t xml:space="preserve">（2026-09-14；分支 </w:t>
             </w:r>
             <w:r>
               <w:rPr>
@@ -1657,7 +2061,7 @@
                 <w:color w:val="8A1F18"/>
                 <w:sz w:val="18"/>
               </w:rPr>
-              <w:t>v0.7.1-赛事版</w:t>
+              <w:t>v0.7.2-赛事版</w:t>
             </w:r>
             <w:r>
               <w:rPr>
@@ -1739,7 +2143,43 @@
                 <w:i w:val="0"/>
                 <w:sz w:val="18"/>
               </w:rPr>
-              <w:t>）；</w:t>
+              <w:t>），另加</w:t>
+            </w:r>
+            <w:r>
+              <w:rPr>
+                <w:rFonts w:ascii="Segoe UI" w:hAnsi="Segoe UI" w:eastAsia="Microsoft YaHei"/>
+                <w:b/>
+                <w:i w:val="0"/>
+                <w:sz w:val="18"/>
+              </w:rPr>
+              <w:t>第 9 项「自我进化」方案稿可视化页</w:t>
+            </w:r>
+            <w:r>
+              <w:rPr>
+                <w:rFonts w:ascii="Segoe UI" w:hAnsi="Segoe UI" w:eastAsia="Microsoft YaHei"/>
+                <w:b w:val="0"/>
+                <w:i w:val="0"/>
+                <w:sz w:val="18"/>
+              </w:rPr>
+              <w:t>（带角标，不计入功能口径）；</w:t>
+            </w:r>
+            <w:r>
+              <w:rPr>
+                <w:rFonts w:ascii="Segoe UI" w:hAnsi="Segoe UI" w:eastAsia="Microsoft YaHei"/>
+                <w:b/>
+                <w:i w:val="0"/>
+                <w:sz w:val="18"/>
+              </w:rPr>
+              <w:t>0.7.2</w:t>
+            </w:r>
+            <w:r>
+              <w:rPr>
+                <w:rFonts w:ascii="Segoe UI" w:hAnsi="Segoe UI" w:eastAsia="Microsoft YaHei"/>
+                <w:b w:val="0"/>
+                <w:i w:val="0"/>
+                <w:sz w:val="18"/>
+              </w:rPr>
+              <w:t>：新增自我进化可视化页；</w:t>
             </w:r>
             <w:r>
               <w:rPr>
@@ -5671,7 +6111,7 @@
                 <w:i w:val="0"/>
                 <w:sz w:val="18"/>
               </w:rPr>
-              <w:t>0.7.1-赛事版（当前发布）</w:t>
+              <w:t>0.7.1-赛事版</w:t>
             </w:r>
           </w:p>
         </w:tc>
@@ -5903,6 +6343,385 @@
                 <w:sz w:val="18"/>
               </w:rPr>
               <w:t>https://faron-demo.pages.dev</w:t>
+            </w:r>
+          </w:p>
+        </w:tc>
+      </w:tr>
+      <w:tr>
+        <w:tc>
+          <w:tcPr>
+            <w:tcW w:type="dxa" w:w="2160"/>
+          </w:tcPr>
+          <w:p>
+            <w:pPr>
+              <w:spacing w:after="40"/>
+            </w:pPr>
+            <w:r>
+              <w:rPr>
+                <w:rFonts w:ascii="Segoe UI" w:hAnsi="Segoe UI" w:eastAsia="Microsoft YaHei"/>
+                <w:b/>
+                <w:i w:val="0"/>
+                <w:sz w:val="18"/>
+              </w:rPr>
+              <w:t>0.7.2-赛事版（当前发布）</w:t>
+            </w:r>
+          </w:p>
+        </w:tc>
+        <w:tc>
+          <w:tcPr>
+            <w:tcW w:type="dxa" w:w="2160"/>
+          </w:tcPr>
+          <w:p>
+            <w:pPr>
+              <w:spacing w:after="40"/>
+            </w:pPr>
+            <w:r>
+              <w:rPr>
+                <w:rFonts w:ascii="Segoe UI" w:hAnsi="Segoe UI" w:eastAsia="Microsoft YaHei"/>
+                <w:b/>
+                <w:i w:val="0"/>
+                <w:sz w:val="18"/>
+              </w:rPr>
+              <w:t>2026-09-14</w:t>
+            </w:r>
+          </w:p>
+        </w:tc>
+        <w:tc>
+          <w:tcPr>
+            <w:tcW w:type="dxa" w:w="2160"/>
+          </w:tcPr>
+          <w:p>
+            <w:pPr>
+              <w:spacing w:after="40"/>
+            </w:pPr>
+            <w:r>
+              <w:rPr>
+                <w:rFonts w:ascii="Segoe UI" w:hAnsi="Segoe UI" w:eastAsia="Microsoft YaHei"/>
+                <w:b/>
+                <w:i w:val="0"/>
+                <w:sz w:val="18"/>
+              </w:rPr>
+              <w:t>① 「自我进化」可视化页</w:t>
+            </w:r>
+            <w:r>
+              <w:rPr>
+                <w:rFonts w:ascii="Segoe UI" w:hAnsi="Segoe UI" w:eastAsia="Microsoft YaHei"/>
+                <w:b w:val="0"/>
+                <w:i w:val="0"/>
+                <w:sz w:val="18"/>
+              </w:rPr>
+              <w:t xml:space="preserve">（侧栏第 9 项，带「方案稿」角标）：应用内 </w:t>
+            </w:r>
+            <w:r>
+              <w:rPr>
+                <w:rFonts w:ascii="Consolas" w:hAnsi="Consolas" w:eastAsia="Microsoft YaHei"/>
+                <w:color w:val="8A1F18"/>
+                <w:sz w:val="18"/>
+              </w:rPr>
+              <w:t>/evolution</w:t>
+            </w:r>
+            <w:r>
+              <w:rPr>
+                <w:rFonts w:ascii="Segoe UI" w:hAnsi="Segoe UI" w:eastAsia="Microsoft YaHei"/>
+                <w:b w:val="0"/>
+                <w:i w:val="0"/>
+                <w:sz w:val="18"/>
+              </w:rPr>
+              <w:t>（</w:t>
+            </w:r>
+            <w:r>
+              <w:rPr>
+                <w:rFonts w:ascii="Consolas" w:hAnsi="Consolas" w:eastAsia="Microsoft YaHei"/>
+                <w:color w:val="8A1F18"/>
+                <w:sz w:val="18"/>
+              </w:rPr>
+              <w:t>src/lib/evolution.ts</w:t>
+            </w:r>
+            <w:r>
+              <w:rPr>
+                <w:rFonts w:ascii="Segoe UI" w:hAnsi="Segoe UI" w:eastAsia="Microsoft YaHei"/>
+                <w:b w:val="0"/>
+                <w:i w:val="0"/>
+                <w:sz w:val="18"/>
+              </w:rPr>
+              <w:t xml:space="preserve"> 纯函数层 + </w:t>
+            </w:r>
+            <w:r>
+              <w:rPr>
+                <w:rFonts w:ascii="Consolas" w:hAnsi="Consolas" w:eastAsia="Microsoft YaHei"/>
+                <w:color w:val="8A1F18"/>
+                <w:sz w:val="18"/>
+              </w:rPr>
+              <w:t>Evolution.tsx</w:t>
+            </w:r>
+            <w:r>
+              <w:rPr>
+                <w:rFonts w:ascii="Segoe UI" w:hAnsi="Segoe UI" w:eastAsia="Microsoft YaHei"/>
+                <w:b w:val="0"/>
+                <w:i w:val="0"/>
+                <w:sz w:val="18"/>
+              </w:rPr>
+              <w:t xml:space="preserve"> + </w:t>
+            </w:r>
+            <w:r>
+              <w:rPr>
+                <w:rFonts w:ascii="Consolas" w:hAnsi="Consolas" w:eastAsia="Microsoft YaHei"/>
+                <w:color w:val="8A1F18"/>
+                <w:sz w:val="18"/>
+              </w:rPr>
+              <w:t>Evolution.css</w:t>
+            </w:r>
+            <w:r>
+              <w:rPr>
+                <w:rFonts w:ascii="Segoe UI" w:hAnsi="Segoe UI" w:eastAsia="Microsoft YaHei"/>
+                <w:b w:val="0"/>
+                <w:i w:val="0"/>
+                <w:sz w:val="18"/>
+              </w:rPr>
+              <w:t xml:space="preserve">）与演示站「自我进化实验室」板块，把 </w:t>
+            </w:r>
+            <w:r>
+              <w:rPr>
+                <w:rFonts w:ascii="Consolas" w:hAnsi="Consolas" w:eastAsia="Microsoft YaHei"/>
+                <w:color w:val="8A1F18"/>
+                <w:sz w:val="18"/>
+              </w:rPr>
+              <w:t>docs/12</w:t>
+            </w:r>
+            <w:r>
+              <w:rPr>
+                <w:rFonts w:ascii="Segoe UI" w:hAnsi="Segoe UI" w:eastAsia="Microsoft YaHei"/>
+                <w:b w:val="0"/>
+                <w:i w:val="0"/>
+                <w:sz w:val="18"/>
+              </w:rPr>
+              <w:t xml:space="preserve"> 联邦配方进化方案稿的闭环跑成可交互代码（六环节 / 收敛曲线 / ε 与 K 可调 / 白名单体检 / A-B 采纳回滚 / RL 对照表）；真数据优先读本机 </w:t>
+            </w:r>
+            <w:r>
+              <w:rPr>
+                <w:rFonts w:ascii="Consolas" w:hAnsi="Consolas" w:eastAsia="Microsoft YaHei"/>
+                <w:color w:val="8A1F18"/>
+                <w:sz w:val="18"/>
+              </w:rPr>
+              <w:t>tasks</w:t>
+            </w:r>
+            <w:r>
+              <w:rPr>
+                <w:rFonts w:ascii="Segoe UI" w:hAnsi="Segoe UI" w:eastAsia="Microsoft YaHei"/>
+                <w:b w:val="0"/>
+                <w:i w:val="0"/>
+                <w:sz w:val="18"/>
+              </w:rPr>
+              <w:t xml:space="preserve"> / </w:t>
+            </w:r>
+            <w:r>
+              <w:rPr>
+                <w:rFonts w:ascii="Consolas" w:hAnsi="Consolas" w:eastAsia="Microsoft YaHei"/>
+                <w:color w:val="8A1F18"/>
+                <w:sz w:val="18"/>
+              </w:rPr>
+              <w:t>task_steps</w:t>
+            </w:r>
+            <w:r>
+              <w:rPr>
+                <w:rFonts w:ascii="Segoe UI" w:hAnsi="Segoe UI" w:eastAsia="Microsoft YaHei"/>
+                <w:b w:val="0"/>
+                <w:i w:val="0"/>
+                <w:sz w:val="18"/>
+              </w:rPr>
+              <w:t>，读不到显示「本机暂无」，无数据走协议仿真；</w:t>
+            </w:r>
+            <w:r>
+              <w:rPr>
+                <w:rFonts w:ascii="Segoe UI" w:hAnsi="Segoe UI" w:eastAsia="Microsoft YaHei"/>
+                <w:b/>
+                <w:i w:val="0"/>
+                <w:sz w:val="18"/>
+              </w:rPr>
+              <w:t>② 悬浮球资源目录递增</w:t>
+            </w:r>
+            <w:r>
+              <w:rPr>
+                <w:rFonts w:ascii="Segoe UI" w:hAnsi="Segoe UI" w:eastAsia="Microsoft YaHei"/>
+                <w:b w:val="0"/>
+                <w:i w:val="0"/>
+                <w:sz w:val="18"/>
+              </w:rPr>
+              <w:t xml:space="preserve"> </w:t>
+            </w:r>
+            <w:r>
+              <w:rPr>
+                <w:rFonts w:ascii="Consolas" w:hAnsi="Consolas" w:eastAsia="Microsoft YaHei"/>
+                <w:color w:val="8A1F18"/>
+                <w:sz w:val="18"/>
+              </w:rPr>
+              <w:t>win-unpacked-0.7.2</w:t>
+            </w:r>
+            <w:r>
+              <w:rPr>
+                <w:rFonts w:ascii="Segoe UI" w:hAnsi="Segoe UI" w:eastAsia="Microsoft YaHei"/>
+                <w:b w:val="0"/>
+                <w:i w:val="0"/>
+                <w:sz w:val="18"/>
+              </w:rPr>
+              <w:t>（覆盖安装防文件占用报错）；</w:t>
+            </w:r>
+            <w:r>
+              <w:rPr>
+                <w:rFonts w:ascii="Segoe UI" w:hAnsi="Segoe UI" w:eastAsia="Microsoft YaHei"/>
+                <w:b/>
+                <w:i w:val="0"/>
+                <w:sz w:val="18"/>
+              </w:rPr>
+              <w:t>③ 演示站同步上线</w:t>
+            </w:r>
+            <w:r>
+              <w:rPr>
+                <w:rFonts w:ascii="Segoe UI" w:hAnsi="Segoe UI" w:eastAsia="Microsoft YaHei"/>
+                <w:b w:val="0"/>
+                <w:i w:val="0"/>
+                <w:sz w:val="18"/>
+              </w:rPr>
+              <w:t>新板块</w:t>
+            </w:r>
+          </w:p>
+        </w:tc>
+        <w:tc>
+          <w:tcPr>
+            <w:tcW w:type="dxa" w:w="2160"/>
+          </w:tcPr>
+          <w:p>
+            <w:pPr>
+              <w:spacing w:after="40"/>
+            </w:pPr>
+            <w:r>
+              <w:rPr>
+                <w:rFonts w:ascii="Segoe UI" w:hAnsi="Segoe UI" w:eastAsia="Microsoft YaHei"/>
+                <w:b w:val="0"/>
+                <w:i w:val="0"/>
+                <w:sz w:val="18"/>
+              </w:rPr>
+              <w:t>✅ 已出包并发布：</w:t>
+            </w:r>
+            <w:r>
+              <w:rPr>
+                <w:rFonts w:ascii="Consolas" w:hAnsi="Consolas" w:eastAsia="Microsoft YaHei"/>
+                <w:color w:val="8A1F18"/>
+                <w:sz w:val="18"/>
+              </w:rPr>
+              <w:t>发布包/法元_0.7.2_赛事版_x64-setup.exe</w:t>
+            </w:r>
+            <w:r>
+              <w:rPr>
+                <w:rFonts w:ascii="Segoe UI" w:hAnsi="Segoe UI" w:eastAsia="Microsoft YaHei"/>
+                <w:b w:val="0"/>
+                <w:i w:val="0"/>
+                <w:sz w:val="18"/>
+              </w:rPr>
+              <w:t xml:space="preserve">（135.11 MB，SHA256 </w:t>
+            </w:r>
+            <w:r>
+              <w:rPr>
+                <w:rFonts w:ascii="Consolas" w:hAnsi="Consolas" w:eastAsia="Microsoft YaHei"/>
+                <w:color w:val="8A1F18"/>
+                <w:sz w:val="18"/>
+              </w:rPr>
+              <w:t>372F224D…</w:t>
+            </w:r>
+            <w:r>
+              <w:rPr>
+                <w:rFonts w:ascii="Segoe UI" w:hAnsi="Segoe UI" w:eastAsia="Microsoft YaHei"/>
+                <w:b w:val="0"/>
+                <w:i w:val="0"/>
+                <w:sz w:val="18"/>
+              </w:rPr>
+              <w:t xml:space="preserve">）；GitHub Release tag </w:t>
+            </w:r>
+            <w:r>
+              <w:rPr>
+                <w:rFonts w:ascii="Segoe UI" w:hAnsi="Segoe UI" w:eastAsia="Microsoft YaHei"/>
+                <w:b/>
+                <w:i w:val="0"/>
+                <w:sz w:val="18"/>
+              </w:rPr>
+              <w:t>`v0.7.2-赛事版`</w:t>
+            </w:r>
+            <w:r>
+              <w:rPr>
+                <w:rFonts w:ascii="Segoe UI" w:hAnsi="Segoe UI" w:eastAsia="Microsoft YaHei"/>
+                <w:b w:val="0"/>
+                <w:i w:val="0"/>
+                <w:sz w:val="18"/>
+              </w:rPr>
+              <w:t xml:space="preserve">（资产 </w:t>
+            </w:r>
+            <w:r>
+              <w:rPr>
+                <w:rFonts w:ascii="Consolas" w:hAnsi="Consolas" w:eastAsia="Microsoft YaHei"/>
+                <w:color w:val="8A1F18"/>
+                <w:sz w:val="18"/>
+              </w:rPr>
+              <w:t>Faron-0.7.2-x64-setup.exe</w:t>
+            </w:r>
+            <w:r>
+              <w:rPr>
+                <w:rFonts w:ascii="Segoe UI" w:hAnsi="Segoe UI" w:eastAsia="Microsoft YaHei"/>
+                <w:b w:val="0"/>
+                <w:i w:val="0"/>
+                <w:sz w:val="18"/>
+              </w:rPr>
+              <w:t xml:space="preserve">）；演示站 </w:t>
+            </w:r>
+            <w:r>
+              <w:rPr>
+                <w:rFonts w:ascii="Segoe UI" w:hAnsi="Segoe UI" w:eastAsia="Microsoft YaHei"/>
+                <w:color w:val="1A4F9C"/>
+                <w:sz w:val="18"/>
+              </w:rPr>
+              <w:t>https://faron-demo.pages.dev</w:t>
+            </w:r>
+            <w:r>
+              <w:rPr>
+                <w:rFonts w:ascii="Segoe UI" w:hAnsi="Segoe UI" w:eastAsia="Microsoft YaHei"/>
+                <w:b w:val="0"/>
+                <w:i w:val="0"/>
+                <w:sz w:val="18"/>
+              </w:rPr>
+              <w:t xml:space="preserve"> ；出包前 </w:t>
+            </w:r>
+            <w:r>
+              <w:rPr>
+                <w:rFonts w:ascii="Consolas" w:hAnsi="Consolas" w:eastAsia="Microsoft YaHei"/>
+                <w:color w:val="8A1F18"/>
+                <w:sz w:val="18"/>
+              </w:rPr>
+              <w:t>npm run build</w:t>
+            </w:r>
+            <w:r>
+              <w:rPr>
+                <w:rFonts w:ascii="Segoe UI" w:hAnsi="Segoe UI" w:eastAsia="Microsoft YaHei"/>
+                <w:b w:val="0"/>
+                <w:i w:val="0"/>
+                <w:sz w:val="18"/>
+              </w:rPr>
+              <w:t xml:space="preserve"> exit 0 + </w:t>
+            </w:r>
+            <w:r>
+              <w:rPr>
+                <w:rFonts w:ascii="Consolas" w:hAnsi="Consolas" w:eastAsia="Microsoft YaHei"/>
+                <w:color w:val="8A1F18"/>
+                <w:sz w:val="18"/>
+              </w:rPr>
+              <w:t>cargo test</w:t>
+            </w:r>
+            <w:r>
+              <w:rPr>
+                <w:rFonts w:ascii="Segoe UI" w:hAnsi="Segoe UI" w:eastAsia="Microsoft YaHei"/>
+                <w:b w:val="0"/>
+                <w:i w:val="0"/>
+                <w:sz w:val="18"/>
+              </w:rPr>
+              <w:t xml:space="preserve"> 17/17 + 预置库个人数据只读核验通过</w:t>
             </w:r>
           </w:p>
         </w:tc>
@@ -9420,7 +10239,7 @@
           <w:b/>
           <w:i w:val="0"/>
         </w:rPr>
-        <w:t>0.7.1</w:t>
+        <w:t>0.7.2</w:t>
       </w:r>
       <w:r>
         <w:rPr>
@@ -9428,7 +10247,7 @@
           <w:b w:val="0"/>
           <w:i w:val="0"/>
         </w:rPr>
-        <w:t xml:space="preserve"> 演进记录（0.5.0 律衡、0.6.0 法元 · Faron 品牌切换、0.7.0 智能体 5 类任务 + 知识图谱 + 多模态、0.7.1 待办与翻译修复 + 发行渠道）；</w:t>
+        <w:t xml:space="preserve"> 演进记录（0.5.0 律衡、0.6.0 法元 · Faron 品牌切换、0.7.0 智能体 5 类任务 + 知识图谱 + 多模态、0.7.1 待办与翻译修复 + 发行渠道、0.7.2 自我进化可视化页 + 演示站同步上线）；</w:t>
       </w:r>
     </w:p>
     <w:p>

</xml_diff>